<commit_message>
Lesson 3 Report Changed:
</commit_message>
<xml_diff>
--- a/Lesson3/Lesson3_Report.docx
+++ b/Lesson3/Lesson3_Report.docx
@@ -171,7 +171,13 @@
         <w:rPr>
           <w:color w:val="215E99" w:themeColor="text2" w:themeTint="BF"/>
         </w:rPr>
-        <w:t>12-4-2026</w:t>
+        <w:t>14</w:t>
+      </w:r>
+      <w:r>
+        <w:rPr>
+          <w:color w:val="215E99" w:themeColor="text2" w:themeTint="BF"/>
+        </w:rPr>
+        <w:t>-4-2026</w:t>
       </w:r>
     </w:p>
     <w:p>
@@ -723,6 +729,21 @@
           <w14:ligatures w14:val="none"/>
         </w:rPr>
       </w:pPr>
+      <w:r>
+        <w:rPr>
+          <w:rFonts w:ascii="Times New Roman" w:eastAsia="Times New Roman" w:hAnsi="Times New Roman" w:cs="Times New Roman"/>
+          <w:b/>
+          <w:bCs/>
+          <w:i/>
+          <w:iCs/>
+          <w:kern w:val="0"/>
+          <w:sz w:val="36"/>
+          <w:szCs w:val="36"/>
+          <w:lang w:val="en-SA"/>
+          <w14:ligatures w14:val="none"/>
+        </w:rPr>
+        <w:t xml:space="preserve"> </w:t>
+      </w:r>
       <w:r>
         <w:rPr>
           <w:rFonts w:ascii="Times New Roman" w:eastAsia="Times New Roman" w:hAnsi="Times New Roman" w:cs="Times New Roman"/>
@@ -1234,7 +1255,7 @@
           </mc:Choice>
           <mc:Fallback>
             <w:pict>
-              <v:rect w14:anchorId="4082E00D" id="Rectangle 1" o:spid="_x0000_s1026" style="width:24.25pt;height:24.25pt;visibility:visible;mso-wrap-style:square;mso-left-percent:-10001;mso-top-percent:-10001;mso-position-horizontal:absolute;mso-position-horizontal-relative:char;mso-position-vertical:absolute;mso-position-vertical-relative:line;mso-left-percent:-10001;mso-top-percent:-10001;v-text-anchor:top" o:gfxdata="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" filled="f" stroked="f">
+              <v:rect w14:anchorId="59EAF300" id="Rectangle 1" o:spid="_x0000_s1026" style="width:24.25pt;height:24.25pt;visibility:visible;mso-wrap-style:square;mso-left-percent:-10001;mso-top-percent:-10001;mso-position-horizontal:absolute;mso-position-horizontal-relative:char;mso-position-vertical:absolute;mso-position-vertical-relative:line;mso-left-percent:-10001;mso-top-percent:-10001;v-text-anchor:top" o:gfxdata="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" filled="f" stroked="f">
                 <o:lock v:ext="edit" aspectratio="t"/>
                 <w10:anchorlock/>
               </v:rect>
@@ -1320,7 +1341,7 @@
           </mc:Choice>
           <mc:Fallback>
             <w:pict>
-              <v:rect w14:anchorId="24756BA5" id="Rectangle 2" o:spid="_x0000_s1026" style="width:24.25pt;height:24.25pt;visibility:visible;mso-wrap-style:square;mso-left-percent:-10001;mso-top-percent:-10001;mso-position-horizontal:absolute;mso-position-horizontal-relative:char;mso-position-vertical:absolute;mso-position-vertical-relative:line;mso-left-percent:-10001;mso-top-percent:-10001;v-text-anchor:top" o:gfxdata="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" filled="f" stroked="f">
+              <v:rect w14:anchorId="64FB9F0D" id="Rectangle 2" o:spid="_x0000_s1026" style="width:24.25pt;height:24.25pt;visibility:visible;mso-wrap-style:square;mso-left-percent:-10001;mso-top-percent:-10001;mso-position-horizontal:absolute;mso-position-horizontal-relative:char;mso-position-vertical:absolute;mso-position-vertical-relative:line;mso-left-percent:-10001;mso-top-percent:-10001;v-text-anchor:top" o:gfxdata="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" filled="f" stroked="f">
                 <o:lock v:ext="edit" aspectratio="t"/>
                 <w10:anchorlock/>
               </v:rect>
@@ -1406,7 +1427,7 @@
           </mc:Choice>
           <mc:Fallback>
             <w:pict>
-              <v:rect w14:anchorId="241D4A69" id="Rectangle 3" o:spid="_x0000_s1026" style="width:24.25pt;height:24.25pt;visibility:visible;mso-wrap-style:square;mso-left-percent:-10001;mso-top-percent:-10001;mso-position-horizontal:absolute;mso-position-horizontal-relative:char;mso-position-vertical:absolute;mso-position-vertical-relative:line;mso-left-percent:-10001;mso-top-percent:-10001;v-text-anchor:top" o:gfxdata="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" filled="f" stroked="f">
+              <v:rect w14:anchorId="6619BA18" id="Rectangle 3" o:spid="_x0000_s1026" style="width:24.25pt;height:24.25pt;visibility:visible;mso-wrap-style:square;mso-left-percent:-10001;mso-top-percent:-10001;mso-position-horizontal:absolute;mso-position-horizontal-relative:char;mso-position-vertical:absolute;mso-position-vertical-relative:line;mso-left-percent:-10001;mso-top-percent:-10001;v-text-anchor:top" o:gfxdata="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" filled="f" stroked="f">
                 <o:lock v:ext="edit" aspectratio="t"/>
                 <w10:anchorlock/>
               </v:rect>

</xml_diff>